<commit_message>
Update Klycya Tayanne - Report.docx
</commit_message>
<xml_diff>
--- a/Klycya Tayanne - Report.docx
+++ b/Klycya Tayanne - Report.docx
@@ -1094,21 +1094,306 @@
     </w:p>
     <w:p>
       <w:pPr>
+        <w:keepNext/>
+        <w:keepLines/>
+        <w:pBdr>
+          <w:top w:val="nil"/>
+          <w:left w:val="nil"/>
+          <w:bottom w:val="nil"/>
+          <w:right w:val="nil"/>
+          <w:between w:val="nil"/>
+        </w:pBdr>
+        <w:spacing w:before="240" w:after="0" w:line="240" w:lineRule="auto"/>
+        <w:rPr>
+          <w:rFonts w:ascii="Play" w:eastAsia="Play" w:hAnsi="Play" w:cs="Play"/>
+          <w:color w:val="0F4761"/>
+          <w:sz w:val="32"/>
+          <w:szCs w:val="32"/>
+        </w:rPr>
+      </w:pPr>
+      <w:r>
+        <w:rPr>
+          <w:rFonts w:ascii="Play" w:eastAsia="Play" w:hAnsi="Play" w:cs="Play"/>
+          <w:color w:val="0F4761"/>
+          <w:sz w:val="32"/>
+          <w:szCs w:val="32"/>
+        </w:rPr>
+        <w:lastRenderedPageBreak/>
+        <w:t>Contents</w:t>
+      </w:r>
+    </w:p>
+    <w:sdt>
+      <w:sdtPr>
+        <w:id w:val="-1939593324"/>
+        <w:docPartObj>
+          <w:docPartGallery w:val="Table of Contents"/>
+          <w:docPartUnique/>
+        </w:docPartObj>
+      </w:sdtPr>
+      <w:sdtContent>
+        <w:p>
+          <w:pPr>
+            <w:pBdr>
+              <w:top w:val="nil"/>
+              <w:left w:val="nil"/>
+              <w:bottom w:val="nil"/>
+              <w:right w:val="nil"/>
+              <w:between w:val="nil"/>
+            </w:pBdr>
+            <w:tabs>
+              <w:tab w:val="right" w:leader="dot" w:pos="9016"/>
+            </w:tabs>
+            <w:spacing w:after="100"/>
+            <w:rPr>
+              <w:rFonts w:ascii="Aptos" w:eastAsia="Aptos" w:hAnsi="Aptos" w:cs="Aptos"/>
+              <w:color w:val="000000"/>
+              <w:sz w:val="24"/>
+              <w:szCs w:val="24"/>
+            </w:rPr>
+          </w:pPr>
+          <w:r>
+            <w:fldChar w:fldCharType="begin"/>
+          </w:r>
+          <w:r>
+            <w:instrText xml:space="preserve"> TOC \h \u \z \t "Heading 1,1,Heading 2,2,Heading 3,3,"</w:instrText>
+          </w:r>
+          <w:r>
+            <w:fldChar w:fldCharType="separate"/>
+          </w:r>
+          <w:hyperlink w:anchor="_heading=h.gjdgxs">
+            <w:r>
+              <w:rPr>
+                <w:color w:val="000000"/>
+              </w:rPr>
+              <w:t>Introduction</w:t>
+            </w:r>
+            <w:r>
+              <w:rPr>
+                <w:color w:val="000000"/>
+              </w:rPr>
+              <w:tab/>
+              <w:t>1</w:t>
+            </w:r>
+          </w:hyperlink>
+        </w:p>
+        <w:p>
+          <w:pPr>
+            <w:pBdr>
+              <w:top w:val="nil"/>
+              <w:left w:val="nil"/>
+              <w:bottom w:val="nil"/>
+              <w:right w:val="nil"/>
+              <w:between w:val="nil"/>
+            </w:pBdr>
+            <w:tabs>
+              <w:tab w:val="right" w:leader="dot" w:pos="9016"/>
+            </w:tabs>
+            <w:spacing w:after="100"/>
+            <w:rPr>
+              <w:rFonts w:ascii="Aptos" w:eastAsia="Aptos" w:hAnsi="Aptos" w:cs="Aptos"/>
+              <w:color w:val="000000"/>
+              <w:sz w:val="24"/>
+              <w:szCs w:val="24"/>
+            </w:rPr>
+          </w:pPr>
+          <w:hyperlink w:anchor="_heading=h.30j0zll">
+            <w:r>
+              <w:rPr>
+                <w:color w:val="000000"/>
+              </w:rPr>
+              <w:t>Chapter 1</w:t>
+            </w:r>
+            <w:r>
+              <w:rPr>
+                <w:color w:val="000000"/>
+              </w:rPr>
+              <w:tab/>
+              <w:t>1</w:t>
+            </w:r>
+          </w:hyperlink>
+        </w:p>
+        <w:p>
+          <w:pPr>
+            <w:pBdr>
+              <w:top w:val="nil"/>
+              <w:left w:val="nil"/>
+              <w:bottom w:val="nil"/>
+              <w:right w:val="nil"/>
+              <w:between w:val="nil"/>
+            </w:pBdr>
+            <w:tabs>
+              <w:tab w:val="right" w:leader="dot" w:pos="9016"/>
+            </w:tabs>
+            <w:spacing w:after="100"/>
+            <w:ind w:left="220"/>
+            <w:rPr>
+              <w:rFonts w:ascii="Aptos" w:eastAsia="Aptos" w:hAnsi="Aptos" w:cs="Aptos"/>
+              <w:color w:val="000000"/>
+              <w:sz w:val="24"/>
+              <w:szCs w:val="24"/>
+            </w:rPr>
+          </w:pPr>
+          <w:hyperlink w:anchor="_heading=h.1fob9te">
+            <w:r>
+              <w:rPr>
+                <w:color w:val="000000"/>
+              </w:rPr>
+              <w:t>Chapter 1.1</w:t>
+            </w:r>
+            <w:r>
+              <w:rPr>
+                <w:color w:val="000000"/>
+              </w:rPr>
+              <w:tab/>
+              <w:t>1</w:t>
+            </w:r>
+          </w:hyperlink>
+        </w:p>
+        <w:p>
+          <w:pPr>
+            <w:pBdr>
+              <w:top w:val="nil"/>
+              <w:left w:val="nil"/>
+              <w:bottom w:val="nil"/>
+              <w:right w:val="nil"/>
+              <w:between w:val="nil"/>
+            </w:pBdr>
+            <w:tabs>
+              <w:tab w:val="right" w:leader="dot" w:pos="9016"/>
+            </w:tabs>
+            <w:spacing w:after="100"/>
+            <w:ind w:left="440"/>
+            <w:rPr>
+              <w:rFonts w:ascii="Aptos" w:eastAsia="Aptos" w:hAnsi="Aptos" w:cs="Aptos"/>
+              <w:color w:val="000000"/>
+              <w:sz w:val="24"/>
+              <w:szCs w:val="24"/>
+            </w:rPr>
+          </w:pPr>
+          <w:hyperlink w:anchor="_heading=h.3znysh7">
+            <w:r>
+              <w:rPr>
+                <w:color w:val="000000"/>
+              </w:rPr>
+              <w:t>Chapter 1.1.1.</w:t>
+            </w:r>
+            <w:r>
+              <w:rPr>
+                <w:color w:val="000000"/>
+              </w:rPr>
+              <w:tab/>
+              <w:t>1</w:t>
+            </w:r>
+          </w:hyperlink>
+        </w:p>
+        <w:p>
+          <w:pPr>
+            <w:pBdr>
+              <w:top w:val="nil"/>
+              <w:left w:val="nil"/>
+              <w:bottom w:val="nil"/>
+              <w:right w:val="nil"/>
+              <w:between w:val="nil"/>
+            </w:pBdr>
+            <w:tabs>
+              <w:tab w:val="right" w:leader="dot" w:pos="9016"/>
+            </w:tabs>
+            <w:spacing w:after="100"/>
+            <w:rPr>
+              <w:rFonts w:ascii="Aptos" w:eastAsia="Aptos" w:hAnsi="Aptos" w:cs="Aptos"/>
+              <w:color w:val="000000"/>
+              <w:sz w:val="24"/>
+              <w:szCs w:val="24"/>
+            </w:rPr>
+          </w:pPr>
+          <w:hyperlink w:anchor="_heading=h.2et92p0">
+            <w:r>
+              <w:rPr>
+                <w:color w:val="000000"/>
+              </w:rPr>
+              <w:t>References</w:t>
+            </w:r>
+            <w:r>
+              <w:rPr>
+                <w:color w:val="000000"/>
+              </w:rPr>
+              <w:tab/>
+              <w:t>2</w:t>
+            </w:r>
+          </w:hyperlink>
+        </w:p>
+        <w:p>
+          <w:r>
+            <w:fldChar w:fldCharType="end"/>
+          </w:r>
+        </w:p>
+      </w:sdtContent>
+    </w:sdt>
+    <w:p/>
+    <w:p/>
+    <w:p/>
+    <w:p/>
+    <w:p/>
+    <w:p/>
+    <w:p/>
+    <w:p/>
+    <w:p/>
+    <w:p/>
+    <w:p/>
+    <w:p/>
+    <w:p/>
+    <w:p/>
+    <w:p/>
+    <w:p/>
+    <w:p/>
+    <w:p/>
+    <w:p/>
+    <w:p/>
+    <w:p/>
+    <w:p/>
+    <w:p/>
+    <w:p/>
+    <w:p>
+      <w:pPr>
+        <w:pStyle w:val="Heading1"/>
+      </w:pPr>
+      <w:r>
+        <w:lastRenderedPageBreak/>
+        <w:t>1. Introduction</w:t>
+      </w:r>
+    </w:p>
+    <w:p>
+      <w:r>
+        <w:t>Online shopping is an important part of retail, and website data can help businesses understand how visitors use their websites and when they are likely to make a purchase. However, a visit does not always lead to a sale. Some visitors browse product pages, some leave quickly, and others complete a purchase. Analysing these patterns can help businesses improve website design and understand customer behaviour.</w:t>
+      </w:r>
+    </w:p>
+    <w:p>
+      <w:r>
+        <w:t>This report examines the Online Shoppers Purchasing Intention dataset using descriptive statistics and three probability distributions: Binomial, Poisson and Normal. The dataset includes information about website sessions, such as the number of pages visited, time spent on different types of pages, visitor characteristics and whether a session resulted in a purchase. The variable Revenue records the purchase outcome. All statistical work should be carried out in Python using a Jupyter Notebook, as required by the assessment.</w:t>
+      </w:r>
+    </w:p>
+    <w:p>
+      <w:r>
+        <w:t xml:space="preserve">The </w:t>
+      </w:r>
+      <w:r>
+        <w:t>objective</w:t>
+      </w:r>
+      <w:r>
+        <w:t xml:space="preserve"> is to summarise visitor behaviour and demonstrate how probability distributions can be used to understand</w:t>
+      </w:r>
+      <w:r>
+        <w:t xml:space="preserve"> different data. </w:t>
+      </w:r>
+    </w:p>
+    <w:p>
+      <w:pPr>
         <w:rPr>
           <w:color w:val="3A3A3A"/>
           <w:sz w:val="40"/>
           <w:szCs w:val="40"/>
         </w:rPr>
       </w:pPr>
-      <w:r>
-        <w:rPr>
-          <w:color w:val="3A3A3A" w:themeColor="background2" w:themeShade="40"/>
-          <w:sz w:val="40"/>
-          <w:szCs w:val="40"/>
-        </w:rPr>
-        <w:lastRenderedPageBreak/>
-        <w:t>Abstr</w:t>
-      </w:r>
     </w:p>
     <w:sectPr>
       <w:footerReference w:type="default" r:id="rId13"/>

</xml_diff>